<commit_message>
CU colaboracion y CU
</commit_message>
<xml_diff>
--- a/SPRINTS/GestiON.docx
+++ b/SPRINTS/GestiON.docx
@@ -429,7 +429,6 @@
         <w:pStyle w:val="Ttulo2"/>
       </w:pPr>
       <w:r>
-        <w:lastRenderedPageBreak/>
         <w:t>4. Oferta Académica</w:t>
       </w:r>
     </w:p>
@@ -620,9 +619,6 @@
       </w:pPr>
       <w:r>
         <w:br w:type="page"/>
-      </w:r>
-      <w:r>
-        <w:lastRenderedPageBreak/>
         <w:t>Diagrama de Caso de Uso</w:t>
       </w:r>
       <w:r>
@@ -712,7 +708,6 @@
         <w:pStyle w:val="Ttulo1"/>
       </w:pPr>
       <w:r>
-        <w:lastRenderedPageBreak/>
         <w:t>Requerimientos funcionales</w:t>
       </w:r>
     </w:p>
@@ -1698,7 +1693,6 @@
                 <w:sz w:val="22"/>
                 <w:szCs w:val="22"/>
               </w:rPr>
-              <w:lastRenderedPageBreak/>
               <w:t>RF-14</w:t>
             </w:r>
           </w:p>
@@ -2752,7 +2746,6 @@
                 <w:sz w:val="22"/>
                 <w:szCs w:val="22"/>
               </w:rPr>
-              <w:lastRenderedPageBreak/>
               <w:t>RNF-06</w:t>
             </w:r>
           </w:p>
@@ -3852,7 +3845,6 @@
         <w:jc w:val="center"/>
       </w:pPr>
       <w:r>
-        <w:lastRenderedPageBreak/>
         <w:t>Casos de Uso de Alta Prioridad</w:t>
       </w:r>
     </w:p>
@@ -4407,11 +4399,6 @@
                 <w:sz w:val="19"/>
               </w:rPr>
               <w:br/>
-            </w:r>
-            <w:r>
-              <w:rPr>
-                <w:sz w:val="19"/>
-              </w:rPr>
               <w:t>3. Ingresa los datos del evento y selecciona el espacio, fecha y horario.</w:t>
             </w:r>
             <w:r>
@@ -4578,7 +4565,6 @@
         <w:br/>
       </w:r>
       <w:r>
-        <w:lastRenderedPageBreak/>
         <w:br/>
       </w:r>
       <w:r>
@@ -5192,11 +5178,6 @@
                 <w:sz w:val="19"/>
               </w:rPr>
               <w:br/>
-            </w:r>
-            <w:r>
-              <w:rPr>
-                <w:sz w:val="19"/>
-              </w:rPr>
               <w:t>A2. Si faltan datos obligatorios, el sistema solicita completar la información.</w:t>
             </w:r>
           </w:p>
@@ -5278,7 +5259,6 @@
           <w:b/>
           <w:sz w:val="28"/>
         </w:rPr>
-        <w:lastRenderedPageBreak/>
         <w:t>CU-05 — Aprobar o denegar préstamo</w:t>
       </w:r>
     </w:p>
@@ -5979,7 +5959,6 @@
         <w:rPr>
           <w:noProof/>
         </w:rPr>
-        <w:lastRenderedPageBreak/>
         <w:drawing>
           <wp:anchor distT="0" distB="0" distL="114300" distR="114300" simplePos="0" relativeHeight="251638272" behindDoc="1" locked="0" layoutInCell="1" allowOverlap="1" wp14:anchorId="5DAF6130" wp14:editId="4191BD07">
             <wp:simplePos x="0" y="0"/>
@@ -6260,43 +6239,35 @@
           <w:b/>
           <w:sz w:val="28"/>
         </w:rPr>
-        <w:t>CU-02 — Crear even</w:t>
-      </w:r>
-      <w:r>
+        <w:t>CU-02 — Crear evento</w:t>
+      </w:r>
+    </w:p>
+    <w:p>
+      <w:pPr>
         <w:rPr>
           <w:b/>
           <w:sz w:val="28"/>
         </w:rPr>
-        <w:t>to</w:t>
-      </w:r>
-    </w:p>
-    <w:p>
-      <w:pPr>
+      </w:pPr>
+      <w:r>
         <w:rPr>
           <w:b/>
           <w:sz w:val="28"/>
         </w:rPr>
-      </w:pPr>
-      <w:r>
+        <w:br w:type="page"/>
+      </w:r>
+    </w:p>
+    <w:p>
+      <w:pPr>
         <w:rPr>
           <w:b/>
           <w:sz w:val="28"/>
         </w:rPr>
-        <w:br w:type="page"/>
-      </w:r>
-    </w:p>
-    <w:p>
-      <w:pPr>
-        <w:rPr>
-          <w:b/>
-          <w:sz w:val="28"/>
-        </w:rPr>
       </w:pPr>
       <w:r>
         <w:rPr>
           <w:noProof/>
         </w:rPr>
-        <w:lastRenderedPageBreak/>
         <w:drawing>
           <wp:anchor distT="0" distB="0" distL="114300" distR="114300" simplePos="0" relativeHeight="251647488" behindDoc="1" locked="0" layoutInCell="1" allowOverlap="1" wp14:anchorId="6D555CF0" wp14:editId="2AA959BB">
             <wp:simplePos x="0" y="0"/>
@@ -6600,7 +6571,6 @@
         <w:rPr>
           <w:noProof/>
         </w:rPr>
-        <w:lastRenderedPageBreak/>
         <w:drawing>
           <wp:anchor distT="0" distB="0" distL="114300" distR="114300" simplePos="0" relativeHeight="251659776" behindDoc="1" locked="0" layoutInCell="1" allowOverlap="1" wp14:anchorId="0414C26B" wp14:editId="2008BB87">
             <wp:simplePos x="0" y="0"/>
@@ -8034,10 +8004,6 @@
 </file>
 
 <file path=customXml/item1.xml><?xml version="1.0" encoding="utf-8"?>
-<b:Sources xmlns:b="http://schemas.openxmlformats.org/officeDocument/2006/bibliography" xmlns="http://schemas.openxmlformats.org/officeDocument/2006/bibliography" SelectedStyle="\APASixthEditionOfficeOnline.xsl" StyleName="APA" Version="6"/>
-</file>
-
-<file path=customXml/item2.xml><?xml version="1.0" encoding="utf-8"?>
 <ct:contentTypeSchema xmlns:ct="http://schemas.microsoft.com/office/2006/metadata/contentType" xmlns:ma="http://schemas.microsoft.com/office/2006/metadata/properties/metaAttributes" ct:_="" ma:_="" ma:contentTypeName="Documento" ma:contentTypeID="0x010100E70A4473AF2E634A9F885EEDFF9E79CD" ma:contentTypeVersion="11" ma:contentTypeDescription="Crear nuevo documento." ma:contentTypeScope="" ma:versionID="9880ef30c4207efe84ad58660c1c183c">
   <xsd:schema xmlns:xsd="http://www.w3.org/2001/XMLSchema" xmlns:xs="http://www.w3.org/2001/XMLSchema" xmlns:p="http://schemas.microsoft.com/office/2006/metadata/properties" xmlns:ns3="a1a0c274-21cd-4bb8-80ec-b5e54bfc2b12" targetNamespace="http://schemas.microsoft.com/office/2006/metadata/properties" ma:root="true" ma:fieldsID="575f8366cc1680b1f11e81fe044a52bf" ns3:_="">
     <xsd:import namespace="a1a0c274-21cd-4bb8-80ec-b5e54bfc2b12"/>
@@ -8225,7 +8191,19 @@
 </ct:contentTypeSchema>
 </file>
 
+<file path=customXml/item2.xml><?xml version="1.0" encoding="utf-8"?>
+<b:Sources xmlns:b="http://schemas.openxmlformats.org/officeDocument/2006/bibliography" xmlns="http://schemas.openxmlformats.org/officeDocument/2006/bibliography" SelectedStyle="\APASixthEditionOfficeOnline.xsl" StyleName="APA" Version="6"/>
+</file>
+
 <file path=customXml/item3.xml><?xml version="1.0" encoding="utf-8"?>
+<p:properties xmlns:p="http://schemas.microsoft.com/office/2006/metadata/properties" xmlns:xsi="http://www.w3.org/2001/XMLSchema-instance" xmlns:pc="http://schemas.microsoft.com/office/infopath/2007/PartnerControls">
+  <documentManagement>
+    <_activity xmlns="a1a0c274-21cd-4bb8-80ec-b5e54bfc2b12" xsi:nil="true"/>
+  </documentManagement>
+</p:properties>
+</file>
+
+<file path=customXml/item4.xml><?xml version="1.0" encoding="utf-8"?>
 <?mso-contentType ?>
 <FormTemplates xmlns="http://schemas.microsoft.com/sharepoint/v3/contenttype/forms">
   <Display>DocumentLibraryForm</Display>
@@ -8234,23 +8212,7 @@
 </FormTemplates>
 </file>
 
-<file path=customXml/item4.xml><?xml version="1.0" encoding="utf-8"?>
-<p:properties xmlns:p="http://schemas.microsoft.com/office/2006/metadata/properties" xmlns:xsi="http://www.w3.org/2001/XMLSchema-instance" xmlns:pc="http://schemas.microsoft.com/office/infopath/2007/PartnerControls">
-  <documentManagement>
-    <_activity xmlns="a1a0c274-21cd-4bb8-80ec-b5e54bfc2b12" xsi:nil="true"/>
-  </documentManagement>
-</p:properties>
-</file>
-
 <file path=customXml/itemProps1.xml><?xml version="1.0" encoding="utf-8"?>
-<ds:datastoreItem xmlns:ds="http://schemas.openxmlformats.org/officeDocument/2006/customXml" ds:itemID="{3FB7A028-638C-4DD0-B1A6-BFE83D362E58}">
-  <ds:schemaRefs>
-    <ds:schemaRef ds:uri="http://schemas.openxmlformats.org/officeDocument/2006/bibliography"/>
-  </ds:schemaRefs>
-</ds:datastoreItem>
-</file>
-
-<file path=customXml/itemProps2.xml><?xml version="1.0" encoding="utf-8"?>
 <ds:datastoreItem xmlns:ds="http://schemas.openxmlformats.org/officeDocument/2006/customXml" ds:itemID="{CDF7D1C5-98C9-46C8-9616-37A8CB776BF5}">
   <ds:schemaRefs>
     <ds:schemaRef ds:uri="http://schemas.microsoft.com/office/2006/metadata/contentType"/>
@@ -8268,15 +8230,15 @@
 </ds:datastoreItem>
 </file>
 
-<file path=customXml/itemProps3.xml><?xml version="1.0" encoding="utf-8"?>
-<ds:datastoreItem xmlns:ds="http://schemas.openxmlformats.org/officeDocument/2006/customXml" ds:itemID="{206EB848-074C-4AAA-9587-4F48A356D124}">
+<file path=customXml/itemProps2.xml><?xml version="1.0" encoding="utf-8"?>
+<ds:datastoreItem xmlns:ds="http://schemas.openxmlformats.org/officeDocument/2006/customXml" ds:itemID="{3FB7A028-638C-4DD0-B1A6-BFE83D362E58}">
   <ds:schemaRefs>
-    <ds:schemaRef ds:uri="http://schemas.microsoft.com/sharepoint/v3/contenttype/forms"/>
+    <ds:schemaRef ds:uri="http://schemas.openxmlformats.org/officeDocument/2006/bibliography"/>
   </ds:schemaRefs>
 </ds:datastoreItem>
 </file>
 
-<file path=customXml/itemProps4.xml><?xml version="1.0" encoding="utf-8"?>
+<file path=customXml/itemProps3.xml><?xml version="1.0" encoding="utf-8"?>
 <ds:datastoreItem xmlns:ds="http://schemas.openxmlformats.org/officeDocument/2006/customXml" ds:itemID="{82E72A6B-17B4-40CC-AABB-E782CF57EB1C}">
   <ds:schemaRefs>
     <ds:schemaRef ds:uri="http://schemas.microsoft.com/office/2006/metadata/properties"/>
@@ -8284,4 +8246,12 @@
     <ds:schemaRef ds:uri="a1a0c274-21cd-4bb8-80ec-b5e54bfc2b12"/>
   </ds:schemaRefs>
 </ds:datastoreItem>
+</file>
+
+<file path=customXml/itemProps4.xml><?xml version="1.0" encoding="utf-8"?>
+<ds:datastoreItem xmlns:ds="http://schemas.openxmlformats.org/officeDocument/2006/customXml" ds:itemID="{206EB848-074C-4AAA-9587-4F48A356D124}">
+  <ds:schemaRefs>
+    <ds:schemaRef ds:uri="http://schemas.microsoft.com/sharepoint/v3/contenttype/forms"/>
+  </ds:schemaRefs>
+</ds:datastoreItem>
 </file>
</xml_diff>